<commit_message>
Robin as corresponding author; fix submission date to Aug 5; add build_docx.py; sync PDF/DOCX + checklist audit
</commit_message>
<xml_diff>
--- a/paper/main.docx
+++ b/paper/main.docx
@@ -1605,13 +1605,26 @@
         <w:pStyle w:val="BodyText"/>
       </w:pPr>
       <w:r>
+        <w:t xml:space="preserve">This work received no specific grant from any funding agency in the public, commercial, or not-for-profit sectors. Manuscript submitted August 5, 2026.</w:t>
+      </w:r>
+    </w:p>
+    <w:p>
+      <w:pPr>
+        <w:pStyle w:val="BodyText"/>
+      </w:pPr>
+      <w:r>
+        <w:t xml:space="preserve">Corresponding author: Robin Chawla (e-mail: robin.chawla.cse14@iitbhu.ac.in).</w:t>
+      </w:r>
+    </w:p>
+    <w:p>
+      <w:pPr>
+        <w:pStyle w:val="BodyText"/>
+      </w:pPr>
+      <w:r>
         <w:rPr>
           <w:b/>
         </w:rPr>
-        <w:t xml:space="preserve">Index Terms:</w:t>
-      </w:r>
-      <w:r>
-        <w:t xml:space="preserve"> </w:t>
+        <w:t xml:space="preserve">Index Terms—</w:t>
       </w:r>
       <w:r>
         <w:t xml:space="preserve">Algorithmic monoculture, credit risk, financial artificial intelligence, large language models, model drift, model risk management, model version migration, reproducible evaluation, third-party model risk.</w:t>
@@ -1632,7 +1645,7 @@
         <w:pStyle w:val="FirstParagraph"/>
       </w:pPr>
       <w:r>
-        <w:t xml:space="preserve">Large language models (LLMs) are increasingly incorporated into financial decision-support workflows[21, 22], including credit screening, counterparty assessment, disclosure review, and operational triage. In these applications, model outputs may influence downstream classifications, escalation decisions, or review priorities. Unlike conventional institution-developed models governed under established model-risk frameworks[7, 8], however, many LLMs are accessed through third-party application programming interfaces whose underlying model versions are controlled by the provider. When an incumbent version is deprecated or replaced, institutions may be required to migrate even when their prompts, data, and downstream processes remain unchanged.</w:t>
+        <w:t xml:space="preserve">Large language models (LLMs) are increasingly incorporated into financial decision-support workflows [21, 22], including credit screening, counterparty assessment, disclosure review, and operational triage. In these applications, model outputs may influence downstream classifications, escalation decisions, or review priorities. Unlike conventional institution-developed models governed under established model-risk frameworks [7, 8], however, many LLMs are accessed through third-party application programming interfaces whose underlying model versions are controlled by the provider. When an incumbent version is deprecated or replaced, institutions may be required to migrate even when their prompts, data, and downstream processes remain unchanged.</w:t>
       </w:r>
     </w:p>
     <w:p>
@@ -1640,7 +1653,7 @@
         <w:pStyle w:val="BodyText"/>
       </w:pPr>
       <w:r>
-        <w:t xml:space="preserve">Such migrations create a distinct form of model-change risk. A successor version may preserve the behavior of its predecessor, in which case migration has limited operational consequence. Alternatively, differences in training data, architecture, optimization, or alignment may cause the same inputs to receive materially different decisions[1, 2, 19]. The size, direction, and structure of this discontinuity cannot be inferred from the fact that a provider designates one version as the recommended replacement for another[24]. It must be measured empirically under controlled input and sampling conditions.</w:t>
+        <w:t xml:space="preserve">Such migrations create a distinct form of model-change risk. A successor version may preserve the behavior of its predecessor, in which case migration has limited operational consequence. Alternatively, differences in training data, architecture, optimization, or alignment may cause the same inputs to receive materially different decisions [1, 2, 19]. The size, direction, and structure of this discontinuity cannot be inferred from the fact that a provider designates one version as the recommended replacement for another [24]. It must be measured empirically under controlled input and sampling conditions.</w:t>
       </w:r>
     </w:p>
     <w:p>
@@ -1670,7 +1683,7 @@
         </m:r>
       </m:oMath>
       <w:r>
-        <w:t xml:space="preserve">-based reference proxy[11, 12].</w:t>
+        <w:t xml:space="preserve">-based reference proxy [11, 12].</w:t>
       </w:r>
     </w:p>
     <w:p>
@@ -1678,7 +1691,7 @@
         <w:pStyle w:val="BodyText"/>
       </w:pPr>
       <w:r>
-        <w:t xml:space="preserve">The paper focuses on deployment-level migration risk: the possibility that a provider-controlled update materially changes decisions within an otherwise fixed LLM pipeline. Because deployments using the same version encounter the same vendor-initiated transition, this mechanism can create synchronized changes across systems pinned to that version[3, 4, 5, 6]. The study does not measure realized cross-institution or market-level effects; instead, it provides controlled evidence that the underlying decision-shock mechanism exists and can be quantified. In this study,</w:t>
+        <w:t xml:space="preserve">The paper focuses on deployment-level migration risk: the possibility that a provider-controlled update materially changes decisions within an otherwise fixed LLM pipeline. Because deployments using the same version encounter the same vendor-initiated transition, this mechanism can create synchronized changes across systems pinned to that version [3, 4, 5, 6]. The study does not measure realized cross-institution or market-level effects; instead, it provides controlled evidence that the underlying decision-shock mechanism exists and can be quantified. In this study,</w:t>
       </w:r>
       <w:r>
         <w:t xml:space="preserve"> </w:t>
@@ -1832,7 +1845,7 @@
         <w:pStyle w:val="FirstParagraph"/>
       </w:pPr>
       <w:r>
-        <w:t xml:space="preserve">Model updates can alter predictions even when task inputs and downstream decision rules remain unchanged. Prior work describes such instance-level regressions as negative flips, in which a successor model overturns a previously correct or stable prediction. MUSCLE examines this problem in LLM evolution and proposes compatibility mechanisms intended to reduce regressions between model versions[1], paralleling regression-free update objectives developed for vision models[26]. Related work on concept drift distinguishes genuine model changes from ordinary within-model variability[25], while standardized, holistic model-evaluation frameworks emphasize the need to evaluate successor versions before deployment[20]. Studies of task underspecification further show that apparently fixed prompts may leave substantial behavioral discretion to the underlying model[2, 27], allowing updates to change responses along dimensions not explicitly constrained by the prompt.</w:t>
+        <w:t xml:space="preserve">Model updates can alter predictions even when task inputs and downstream decision rules remain unchanged. Prior work describes such instance-level regressions as negative flips, in which a successor model overturns a previously correct or stable prediction. MUSCLE examines this problem in LLM evolution and proposes compatibility mechanisms intended to reduce regressions between model versions [1], paralleling regression-free update objectives developed for vision models [26]. Related work on concept drift distinguishes genuine model changes from ordinary within-model variability [25], while standardized, holistic model-evaluation frameworks emphasize the need to evaluate successor versions before deployment [20]. Studies of task underspecification further show that apparently fixed prompts may leave substantial behavioral discretion to the underlying model [2, 27], allowing updates to change responses along dimensions not explicitly constrained by the prompt.</w:t>
       </w:r>
     </w:p>
     <w:p>
@@ -1858,7 +1871,7 @@
         <w:pStyle w:val="FirstParagraph"/>
       </w:pPr>
       <w:r>
-        <w:t xml:space="preserve">A growing literature examines the possibility that widespread reliance on similar artificial intelligence systems may create correlated behavior across financial institutions and markets. Shared foundation models, common training data, and similar optimization objectives may cause otherwise independent users to produce aligned decisions, thereby reducing effective model diversity and increasing susceptibility to common failures[23, 3]. Related work has linked such convergence to algorithmic herding, concentration risk, and broader forms of systemic fragility[4, 5], while supervisory research has begun to identify AI homogenization as a potential source of correlated financial risk[6, 28].</w:t>
+        <w:t xml:space="preserve">A growing literature examines the possibility that widespread reliance on similar artificial intelligence systems may create correlated behavior across financial institutions and markets. Shared foundation models, common training data, and similar optimization objectives may cause otherwise independent users to produce aligned decisions, thereby reducing effective model diversity and increasing susceptibility to common failures [23, 3]. Related work has linked such convergence to algorithmic herding, concentration risk, and broader forms of systemic fragility [4, 5], while supervisory research has begun to identify AI homogenization as a potential source of correlated financial risk [6, 28].</w:t>
       </w:r>
     </w:p>
     <w:p>
@@ -1903,7 +1916,7 @@
         </m:r>
       </m:oMath>
       <w:r>
-        <w:t xml:space="preserve">[13], Scott’s</w:t>
+        <w:t xml:space="preserve"> [13], Scott’s</w:t>
       </w:r>
       <w:r>
         <w:t xml:space="preserve"> </w:t>
@@ -1914,7 +1927,7 @@
         </m:r>
       </m:oMath>
       <w:r>
-        <w:t xml:space="preserve">[14], and Gwet’s AC1[10] (with Fleiss’ generalization to multiple raters[15]). In this study, the two model versions are treated as paired raters that assign one of three credit-health labels (SAFE, WATCH, or DISTRESS) to the same company-date-replicate cells. These statistics summarize the extent to which the two versions produce consistent classifications beyond the level expected from their marginal label distributions.</w:t>
+        <w:t xml:space="preserve"> [14], and Gwet’s AC1 [10] (with Fleiss’ generalization to multiple raters [15]). In this study, the two model versions are treated as paired raters that assign one of three credit-health labels (SAFE, WATCH, or DISTRESS) to the same company-date-replicate cells. These statistics summarize the extent to which the two versions produce consistent classifications beyond the level expected from their marginal label distributions.</w:t>
       </w:r>
     </w:p>
     <w:p>
@@ -1950,7 +1963,7 @@
         <w:t xml:space="preserve"> </w:t>
       </w:r>
       <w:r>
-        <w:t xml:space="preserve">paradox[16]. Gwet’s AC1 is less sensitive to this prevalence effect, while Scott’s</w:t>
+        <w:t xml:space="preserve">paradox [16]. Gwet’s AC1 is less sensitive to this prevalence effect, while Scott’s</w:t>
       </w:r>
       <w:r>
         <w:t xml:space="preserve"> </w:t>
@@ -1998,7 +2011,7 @@
         <w:pStyle w:val="FirstParagraph"/>
       </w:pPr>
       <w:r>
-        <w:t xml:space="preserve">Model-risk management frameworks emphasize validation, ongoing monitoring, change control, documentation, effective challenge, and institutional accountability for third-party models. In the United States, SR 11-7 historically established these expectations, but its lifecycle largely assumes that an institution can identify when a model changes and initiate review before the modified model enters production[7].</w:t>
+        <w:t xml:space="preserve">Model-risk management frameworks emphasize validation, ongoing monitoring, change control, documentation, effective challenge, and institutional accountability for third-party models. In the United States, SR 11-7 historically established these expectations, but its lifecycle largely assumes that an institution can identify when a model changes and initiate review before the modified model enters production [7].</w:t>
       </w:r>
     </w:p>
     <w:p>
@@ -2006,7 +2019,7 @@
         <w:pStyle w:val="BodyText"/>
       </w:pPr>
       <w:r>
-        <w:t xml:space="preserve">Vendor-hosted LLMs complicate this assumption because model versions may be updated, replaced, or deprecated according to the provider’s schedule. A migration can therefore alter model behavior even when the institution holds its prompts, inputs, application logic, and downstream controls fixed. Recent research has proposed broader governance approaches for generative and agentic AI[9], but the present study addresses a narrower empirical problem: decision discontinuity caused specifically by vendor-directed model-version migration. We operationalize this risk through paired version testing, a within-version noise floor, and measures of excess disagreement, distributional shift, churn, and directional drift. The corresponding supervisory implications and proposed control are developed in Section </w:t>
+        <w:t xml:space="preserve">Vendor-hosted LLMs complicate this assumption because model versions may be updated, replaced, or deprecated according to the provider’s schedule. A migration can therefore alter model behavior even when the institution holds its prompts, inputs, application logic, and downstream controls fixed. Recent research has proposed broader governance approaches for generative and agentic AI [9], but the present study addresses a narrower empirical problem: decision discontinuity caused specifically by vendor-directed model-version migration. We operationalize this risk through paired version testing, a within-version noise floor, and measures of excess disagreement, distributional shift, churn, and directional drift. The corresponding supervisory implications and proposed control are developed in Section </w:t>
       </w:r>
       <w:hyperlink w:anchor="sec:gov">
         <w:r>
@@ -2035,7 +2048,7 @@
         <w:pStyle w:val="FirstParagraph"/>
       </w:pPr>
       <w:r>
-        <w:t xml:space="preserve">Empirical LLM evaluations are sensitive to model versions, prompts, sampling settings, data selection, exclusion rules, and statistical choices[31], while proprietary endpoint changes may prevent exact retrospective replay. We therefore specify the migration pairs, evaluation grid, prompt, seeds, endpoints, reference-label procedure, and decision rule before confirmatory data collection[30]; assign the frozen protocol a cryptographic hash; preserve immutable call-level responses and configurations; and regenerate all reported results through a seeded, build-validated analysis pipeline[32]. The archived responses, rather than future API replay, constitute the empirical record. Full procedural details are provided in Section </w:t>
+        <w:t xml:space="preserve">Empirical LLM evaluations are sensitive to model versions, prompts, sampling settings, data selection, exclusion rules, and statistical choices [31], while proprietary endpoint changes may prevent exact retrospective replay. We therefore specify the migration pairs, evaluation grid, prompt, seeds, endpoints, reference-label procedure, and decision rule before confirmatory data collection [30]; assign the frozen protocol a cryptographic hash; preserve immutable call-level responses and configurations; and regenerate all reported results through a seeded, build-validated analysis pipeline [32]. The archived responses, rather than future API replay, constitute the empirical record. Full procedural details are provided in Section </w:t>
       </w:r>
       <w:hyperlink w:anchor="subsec:freeze">
         <w:r>
@@ -4293,7 +4306,7 @@
         </m:r>
       </m:oMath>
       <w:r>
-        <w:t xml:space="preserve">[13], Scott’s</w:t>
+        <w:t xml:space="preserve"> [13], Scott’s</w:t>
       </w:r>
       <w:r>
         <w:t xml:space="preserve"> </w:t>
@@ -4304,7 +4317,7 @@
         </m:r>
       </m:oMath>
       <w:r>
-        <w:t xml:space="preserve">[14], and Gwet’s AC1[10]) computed between the paired incumbent and successor labels. Reporting multiple statistics reduces dependence on any single formulation of expected agreement, particularly when the category marginals are imbalanced.</w:t>
+        <w:t xml:space="preserve"> [14], and Gwet’s AC1 [10]) computed between the paired incumbent and successor labels. Reporting multiple statistics reduces dependence on any single formulation of expected agreement, particularly when the category marginals are imbalanced.</w:t>
       </w:r>
     </w:p>
     <w:p>
@@ -4312,7 +4325,7 @@
         <w:pStyle w:val="BodyText"/>
       </w:pPr>
       <w:r>
-        <w:t xml:space="preserve">As a supporting directional diagnostic, a continuity-corrected McNemar test[17] is applied to the binary indicator</w:t>
+        <w:t xml:space="preserve">As a supporting directional diagnostic, a continuity-corrected McNemar test [17] is applied to the binary indicator</w:t>
       </w:r>
       <w:r>
         <w:t xml:space="preserve"> </w:t>
@@ -4691,7 +4704,7 @@
         <w:pStyle w:val="BodyText"/>
       </w:pPr>
       <w:r>
-        <w:t xml:space="preserve">Statistical uncertainty is estimated using a cluster bootstrap[18] with companies as the resampling unit. Clustering at the company level preserves dependence among repeated analysis dates and replicates for the same firm. For each of 2</w:t>
+        <w:t xml:space="preserve">Statistical uncertainty is estimated using a cluster bootstrap [18] with companies as the resampling unit. Clustering at the company level preserves dependence among repeated analysis dates and replicates for the same firm. For each of 2</w:t>
       </w:r>
       <w:r>
         <w:t xml:space="preserve">,</w:t>
@@ -5095,7 +5108,7 @@
         <w:t xml:space="preserve"> </w:t>
       </w:r>
       <w:r>
-        <w:t xml:space="preserve">model[12]. This reference is reproducible but is not treated as realized default ground truth; it serves only as a reproducible yardstick for the secondary accuracy analysis. For each company–date cell, the reference score is calculated from the same financial statements supplied to the LLMs, but the formula and thresholds are not shown to the models during inference.</w:t>
+        <w:t xml:space="preserve">model [12]. This reference is reproducible but is not treated as realized default ground truth; it serves only as a reproducible yardstick for the secondary accuracy analysis. For each company–date cell, the reference score is calculated from the same financial statements supplied to the LLMs, but the formula and thresholds are not shown to the models during inference.</w:t>
       </w:r>
     </w:p>
     <w:p>
@@ -5679,7 +5692,7 @@
         </m:r>
       </m:oMath>
       <w:r>
-        <w:t xml:space="preserve">-score[11]. The reference proxy is deterministic and reproducible for every company–date observation, allowing classification performance to be evaluated without relying on subjective analyst judgments, though it remains a rule-based proxy rather than realized default ground truth.</w:t>
+        <w:t xml:space="preserve">-score [11]. The reference proxy is deterministic and reproducible for every company–date observation, allowing classification performance to be evaluated without relying on subjective analyst judgments, though it remains a rule-based proxy rather than realized default ground truth.</w:t>
       </w:r>
     </w:p>
     <w:p>
@@ -5730,7 +5743,7 @@
         <w:pStyle w:val="FirstParagraph"/>
       </w:pPr>
       <w:r>
-        <w:t xml:space="preserve">The study evaluates two vendor-declared model-version migrations, each involving an incumbent model and a vendor-positioned successor version. Exact snapshot identifiers are recorded and treated as experimental artifacts so that the analysis refers to specific deployed versions rather than broader model-family names, whose capabilities providers typically document only at the level of aggregate technical reports[29]. The evaluated migration pairs are summarized in Table </w:t>
+        <w:t xml:space="preserve">The study evaluates two vendor-declared model-version migrations, each involving an incumbent model and a vendor-positioned successor version. Exact snapshot identifiers are recorded and treated as experimental artifacts so that the analysis refers to specific deployed versions rather than broader model-family names, whose capabilities providers typically document only at the level of aggregate technical reports [29]. The evaluated migration pairs are summarized in Table </w:t>
       </w:r>
       <w:hyperlink w:anchor="tab:models">
         <w:r>
@@ -5741,7 +5754,7 @@
         </w:r>
       </w:hyperlink>
       <w:r>
-        <w:t xml:space="preserve">; the exact model identifiers and each announced shutdown date are recorded from the providers’ deprecation documentation as of the protocol-freeze date (4 July 2026)[33, 34]. The successor versions actually evaluated are fixed by the frozen experiment and are reported as run.</w:t>
+        <w:t xml:space="preserve">; the exact model identifiers and each announced shutdown date are recorded from the providers’ deprecation documentation as of the protocol-freeze date (4 July 2026) [33, 34]. The successor versions actually evaluated are fixed by the frozen experiment and are reported as run.</w:t>
       </w:r>
     </w:p>
     <w:tbl>
@@ -8783,7 +8796,7 @@
         <w:pStyle w:val="FirstParagraph"/>
       </w:pPr>
       <w:r>
-        <w:t xml:space="preserve">The comparison between the two migrations is robust to the choice of chance-corrected agreement statistic[13, 14, 10]. For OpenAI,</w:t>
+        <w:t xml:space="preserve">The comparison between the two migrations is robust to the choice of chance-corrected agreement statistic [13, 14, 10]. For OpenAI,</w:t>
       </w:r>
     </w:p>
     <w:p>
@@ -8988,7 +9001,7 @@
         </m:r>
       </m:oMath>
       <w:r>
-        <w:t xml:space="preserve">[16].</w:t>
+        <w:t xml:space="preserve"> [16].</w:t>
       </w:r>
     </w:p>
     <w:p>
@@ -9845,7 +9858,7 @@
         </m:r>
       </m:oMath>
       <w:r>
-        <w:t xml:space="preserve">-based label serves only as a deterministic reference proxy for the secondary outcome analysis[12]; the primary instability, agreement, churn, and directional-drift results depend solely on paired model outputs. More broadly, the findings establish a deployment-level mechanism through which systems using the same vendor version could experience a common behavioral change when migrated to the same successor[3, 23, 6]. The study does not measure cross-institutional adoption, realized losses, or market-level systemic effects. It demonstrates that the shared-update mechanism exists and can be measured, motivating the governance control developed in Section </w:t>
+        <w:t xml:space="preserve">-based label serves only as a deterministic reference proxy for the secondary outcome analysis [12]; the primary instability, agreement, churn, and directional-drift results depend solely on paired model outputs. More broadly, the findings establish a deployment-level mechanism through which systems using the same vendor version could experience a common behavioral change when migrated to the same successor [3, 23, 6]. The study does not measure cross-institutional adoption, realized losses, or market-level systemic effects. It demonstrates that the shared-update mechanism exists and can be measured, motivating the governance control developed in Section </w:t>
       </w:r>
       <w:hyperlink w:anchor="sec:gov">
         <w:r>
@@ -9874,7 +9887,7 @@
         <w:pStyle w:val="FirstParagraph"/>
       </w:pPr>
       <w:r>
-        <w:t xml:space="preserve">SR 11-7 historically organized U.S. model-risk governance around independent validation, effective challenge, ongoing monitoring, change management, and institutional responsibility for third-party models[7]. Its lifecycle generally assumes that an institution can identify when a model changes and evaluate the modified model before production use. Vendor-managed foundation models weaken this assumption because the provider determines the successor version and deprecation schedule, while the surrounding prompt, application, and API interface may remain substantially unchanged. A migration can therefore substitute one decision function for another without appearing as a conventional redevelopment event.</w:t>
+        <w:t xml:space="preserve">SR 11-7 historically organized U.S. model-risk governance around independent validation, effective challenge, ongoing monitoring, change management, and institutional responsibility for third-party models [7]. Its lifecycle generally assumes that an institution can identify when a model changes and evaluate the modified model before production use. Vendor-managed foundation models weaken this assumption because the provider determines the successor version and deprecation schedule, while the surrounding prompt, application, and API interface may remain substantially unchanged. A migration can therefore substitute one decision function for another without appearing as a conventional redevelopment event.</w:t>
       </w:r>
     </w:p>
     <w:p>
@@ -9882,7 +9895,7 @@
         <w:pStyle w:val="BodyText"/>
       </w:pPr>
       <w:r>
-        <w:t xml:space="preserve">The governance gap is sharper under the current framework. SR 26-2, which replaced SR 11-7 in April 2026, expressly excludes generative and agentic AI from its scope because of their novelty and rapid evolution[8]. The class of systems evaluated in this study therefore falls outside the revised guidance. Moreover, although SR 26-2 strengthens the treatment of concentration and dependency within an institution’s model portfolio, it does not address correlated behavioral changes across institutions or deployments that depend on the same vendor version. The resulting gap is twofold: generative-AI systems are excluded from the revised framework, and the cross-deployment consequences of a common vendor update are not directly governed.</w:t>
+        <w:t xml:space="preserve">The governance gap is sharper under the current framework. SR 26-2, which replaced SR 11-7 in April 2026, expressly excludes generative and agentic AI from its scope because of their novelty and rapid evolution [8]. The class of systems evaluated in this study therefore falls outside the revised guidance. Moreover, although SR 26-2 strengthens the treatment of concentration and dependency within an institution’s model portfolio, it does not address correlated behavioral changes across institutions or deployments that depend on the same vendor version. The resulting gap is twofold: generative-AI systems are excluded from the revised framework, and the cross-deployment consequences of a common vendor update are not directly governed.</w:t>
       </w:r>
     </w:p>
     <w:p>
@@ -9909,7 +9922,7 @@
         <w:pStyle w:val="BodyText"/>
       </w:pPr>
       <w:r>
-        <w:t xml:space="preserve">Shared reliance on the same hosted version also creates a concentration channel beyond the model inventory of a single institution[6]. Multiple deployments may encounter the same provider-initiated change at approximately the same time. This study does not establish realized cross-institutional losses or systemic instability; it identifies the decision-level mechanism through which a common migration could produce correlated movement across deployments pinned to the shared version.</w:t>
+        <w:t xml:space="preserve">Shared reliance on the same hosted version also creates a concentration channel beyond the model inventory of a single institution [6]. Multiple deployments may encounter the same provider-initiated change at approximately the same time. This study does not establish realized cross-institutional losses or systemic instability; it identifies the decision-level mechanism through which a common migration could produce correlated movement across deployments pinned to the shared version.</w:t>
       </w:r>
     </w:p>
     <w:p>
@@ -10564,19 +10577,64 @@
         <w:pStyle w:val="FirstParagraph"/>
       </w:pPr>
       <w:r>
-        <w:t xml:space="preserve">We release: (i) the immutable, read-only, SHA-256-stamped raw data (per-call model, seed, prompt hash, timestamp, tokens, cost, and raw response); (ii) the preregistration, its cryptographic freeze receipt, and the amendments log; (iii) the deterministic, seeded analysis pipeline that regenerates every table byte-for-byte, with a build gate that rejects any manuscript number disagreeing with the frozen analysis; and (iv) the capture and monitoring harness (the pre-migration parallel-run metric).</w:t>
-      </w:r>
-      <w:r>
-        <w:t xml:space="preserve"> </w:t>
+        <w:t xml:space="preserve">To support reproduction, we release: (i) the immutable, read-only,</w:t>
+      </w:r>
+      <w:r>
+        <w:t xml:space="preserve"> </w:t>
+      </w:r>
+      <w:r>
+        <w:t xml:space="preserve">SHA-256-stamped raw dataset (</w:t>
       </w:r>
       <w:r>
         <w:rPr>
-          <w:b/>
+          <w:rStyle w:val="VerbatimChar"/>
         </w:rPr>
-        <w:t xml:space="preserve">For review</w:t>
-      </w:r>
-      <w:r>
-        <w:t xml:space="preserve">, the complete artifact (code, exact version strings, seeds, prompts, raw responses, and a manifest of SHA-256 hashes) is available anonymously at</w:t>
+        <w:t xml:space="preserve">data/raw/</w:t>
+      </w:r>
+      <w:r>
+        <w:t xml:space="preserve">), containing 14</w:t>
+      </w:r>
+      <w:r>
+        <w:t xml:space="preserve">,</w:t>
+      </w:r>
+      <w:r>
+        <w:t xml:space="preserve">400 logged</w:t>
+      </w:r>
+      <w:r>
+        <w:t xml:space="preserve"> </w:t>
+      </w:r>
+      <w:r>
+        <w:t xml:space="preserve">calls with the per-call model, seed, prompt hash, timestamp, token usage, cost,</w:t>
+      </w:r>
+      <w:r>
+        <w:t xml:space="preserve"> </w:t>
+      </w:r>
+      <w:r>
+        <w:t xml:space="preserve">and raw response; (ii) the pre-registration materials and the cryptographic</w:t>
+      </w:r>
+      <w:r>
+        <w:t xml:space="preserve"> </w:t>
+      </w:r>
+      <w:r>
+        <w:t xml:space="preserve">freeze receipt; (iii) the deterministic, seeded analysis pipeline that</w:t>
+      </w:r>
+      <w:r>
+        <w:t xml:space="preserve"> </w:t>
+      </w:r>
+      <w:r>
+        <w:t xml:space="preserve">regenerates every table and figure in this paper, together with a replication</w:t>
+      </w:r>
+      <w:r>
+        <w:t xml:space="preserve"> </w:t>
+      </w:r>
+      <w:r>
+        <w:t xml:space="preserve">check; and (iv) the capture and monitoring harness (the pre-migration</w:t>
+      </w:r>
+      <w:r>
+        <w:t xml:space="preserve"> </w:t>
+      </w:r>
+      <w:r>
+        <w:t xml:space="preserve">parallel-run metric). Code and data are available at</w:t>
       </w:r>
       <w:r>
         <w:t xml:space="preserve"> </w:t>
@@ -10586,59 +10644,121 @@
           <w:rPr>
             <w:rStyle w:val="Hyperlink"/>
           </w:rPr>
-          <w:t xml:space="preserve">[anonymized repository URL]</w:t>
+          <w:t xml:space="preserve">https://github.com/samirrc2/version-migration-shock</w:t>
         </w:r>
       </w:hyperlink>
       <w:r>
-        <w:t xml:space="preserve">, with the raw-response dataset deposited under an embargoed Zenodo record whose reviewer access token is provided in the submission system. The public Zenodo DOI will be released, and the repository de-anonymized, on acceptance; the frozen hashes let any reader verify the released data against the numbers reported here.</w:t>
+        <w:t xml:space="preserve">.</w:t>
+      </w:r>
+      <w:r>
+        <w:t xml:space="preserve"> </w:t>
+      </w:r>
+      <w:r>
+        <w:t xml:space="preserve">A Code Ocean compute capsule enabling keys-free reproduction is available at</w:t>
+      </w:r>
+      <w:r>
+        <w:t xml:space="preserve"> </w:t>
+      </w:r>
+      <w:hyperlink r:id="rId59">
+        <w:r>
+          <w:rPr>
+            <w:rStyle w:val="Hyperlink"/>
+          </w:rPr>
+          <w:t xml:space="preserve">https://doi.org/10.24433/CO.2874343.v1</w:t>
+        </w:r>
+      </w:hyperlink>
+      <w:r>
+        <w:t xml:space="preserve"> </w:t>
+      </w:r>
+      <w:r>
+        <w:t xml:space="preserve">(DOI: </w:t>
+      </w:r>
+      <w:r>
+        <w:rPr>
+          <w:rStyle w:val="VerbatimChar"/>
+        </w:rPr>
+        <w:t xml:space="preserve">10.24433/CO.2874343.v1</w:t>
+      </w:r>
+      <w:r>
+        <w:t xml:space="preserve">).</w:t>
+      </w:r>
+      <w:r>
+        <w:t xml:space="preserve"> </w:t>
+      </w:r>
+      <w:r>
+        <w:t xml:space="preserve">The dataset SHA-256 hashes and analysis commit hash are recorded in the</w:t>
+      </w:r>
+      <w:r>
+        <w:t xml:space="preserve"> </w:t>
+      </w:r>
+      <w:r>
+        <w:t xml:space="preserve">supplementary manifest.</w:t>
       </w:r>
     </w:p>
     <w:p>
       <w:pPr>
         <w:pStyle w:val="Heading1"/>
       </w:pPr>
-      <w:bookmarkStart w:id="59" w:name="acknowledgment"/>
+      <w:bookmarkStart w:id="60" w:name="acknowledgment"/>
       <w:r>
         <w:t xml:space="preserve">Acknowledgment</w:t>
       </w:r>
-      <w:bookmarkEnd w:id="59"/>
+      <w:bookmarkEnd w:id="60"/>
     </w:p>
     <w:p>
       <w:pPr>
         <w:pStyle w:val="FirstParagraph"/>
       </w:pPr>
       <w:r>
+        <w:t xml:space="preserve">The authors thank colleagues and reviewers for feedback.</w:t>
+      </w:r>
+    </w:p>
+    <w:p>
+      <w:pPr>
+        <w:pStyle w:val="Heading1"/>
+      </w:pPr>
+      <w:bookmarkStart w:id="61" w:name="use-of-generative-ai"/>
+      <w:r>
+        <w:t xml:space="preserve">Use of Generative AI</w:t>
+      </w:r>
+      <w:bookmarkEnd w:id="61"/>
+    </w:p>
+    <w:p>
+      <w:pPr>
+        <w:pStyle w:val="FirstParagraph"/>
+      </w:pPr>
+      <w:r>
         <w:t xml:space="preserve">The authors acknowledge the use of artificial intelligence (AI) tools for the</w:t>
       </w:r>
       <w:r>
         <w:t xml:space="preserve"> </w:t>
       </w:r>
       <w:r>
-        <w:t xml:space="preserve">preparation of this manuscript. Specifically, OpenAI’s ChatGPT and Anthropic’s</w:t>
-      </w:r>
-      <w:r>
-        <w:t xml:space="preserve"> </w:t>
-      </w:r>
-      <w:r>
-        <w:t xml:space="preserve">Claude (2026) were employed to support tasks such as text drafting, language</w:t>
-      </w:r>
-      <w:r>
-        <w:t xml:space="preserve"> </w:t>
-      </w:r>
-      <w:r>
-        <w:t xml:space="preserve">polishing, formatting guidance, and code review. All outputs from these tools</w:t>
-      </w:r>
-      <w:r>
-        <w:t xml:space="preserve"> </w:t>
-      </w:r>
-      <w:r>
-        <w:t xml:space="preserve">were critically examined, verified, and edited by the authors to ensure accuracy</w:t>
-      </w:r>
-      <w:r>
-        <w:t xml:space="preserve"> </w:t>
-      </w:r>
-      <w:r>
-        <w:t xml:space="preserve">and originality.</w:t>
+        <w:t xml:space="preserve">preparation of this manuscript. Specifically, OpenAI’s ChatGPT (GPT-5, 2025)</w:t>
+      </w:r>
+      <w:r>
+        <w:t xml:space="preserve"> </w:t>
+      </w:r>
+      <w:r>
+        <w:t xml:space="preserve">and Anthropic’s Claude were employed to support tasks such as text drafting,</w:t>
+      </w:r>
+      <w:r>
+        <w:t xml:space="preserve"> </w:t>
+      </w:r>
+      <w:r>
+        <w:t xml:space="preserve">language polishing, formatting guidance, and code review. All outputs from</w:t>
+      </w:r>
+      <w:r>
+        <w:t xml:space="preserve"> </w:t>
+      </w:r>
+      <w:r>
+        <w:t xml:space="preserve">these tools were critically examined, verified, and edited by the authors to</w:t>
+      </w:r>
+      <w:r>
+        <w:t xml:space="preserve"> </w:t>
+      </w:r>
+      <w:r>
+        <w:t xml:space="preserve">ensure accuracy and originality.</w:t>
       </w:r>
     </w:p>
     <w:p>
@@ -10687,7 +10807,7 @@
       <w:r>
         <w:t xml:space="preserve"> </w:t>
       </w:r>
-      <w:hyperlink r:id="rId60">
+      <w:hyperlink r:id="rId62">
         <w:r>
           <w:rPr>
             <w:rStyle w:val="Hyperlink"/>
@@ -10722,7 +10842,7 @@
       <w:r>
         <w:t xml:space="preserve"> </w:t>
       </w:r>
-      <w:hyperlink r:id="rId61">
+      <w:hyperlink r:id="rId63">
         <w:r>
           <w:rPr>
             <w:rStyle w:val="Hyperlink"/>
@@ -10769,7 +10889,7 @@
       <w:r>
         <w:t xml:space="preserve"> </w:t>
       </w:r>
-      <w:hyperlink r:id="rId62">
+      <w:hyperlink r:id="rId64">
         <w:r>
           <w:rPr>
             <w:rStyle w:val="Hyperlink"/>
@@ -10846,7 +10966,7 @@
       <w:r>
         <w:t xml:space="preserve"> </w:t>
       </w:r>
-      <w:hyperlink r:id="rId63">
+      <w:hyperlink r:id="rId65">
         <w:r>
           <w:rPr>
             <w:rStyle w:val="Hyperlink"/>
@@ -11258,7 +11378,7 @@
       <w:r>
         <w:t xml:space="preserve"> </w:t>
       </w:r>
-      <w:hyperlink r:id="rId64">
+      <w:hyperlink r:id="rId66">
         <w:r>
           <w:rPr>
             <w:rStyle w:val="Hyperlink"/>
@@ -11347,7 +11467,7 @@
       <w:r>
         <w:t xml:space="preserve"> </w:t>
       </w:r>
-      <w:hyperlink r:id="rId65">
+      <w:hyperlink r:id="rId67">
         <w:r>
           <w:rPr>
             <w:rStyle w:val="Hyperlink"/>
@@ -11382,7 +11502,7 @@
       <w:r>
         <w:t xml:space="preserve"> </w:t>
       </w:r>
-      <w:hyperlink r:id="rId66">
+      <w:hyperlink r:id="rId68">
         <w:r>
           <w:rPr>
             <w:rStyle w:val="Hyperlink"/>
@@ -11627,7 +11747,7 @@
       <w:r>
         <w:t xml:space="preserve"> </w:t>
       </w:r>
-      <w:hyperlink r:id="rId67">
+      <w:hyperlink r:id="rId69">
         <w:r>
           <w:rPr>
             <w:rStyle w:val="Hyperlink"/>
@@ -11764,7 +11884,7 @@
       <w:r>
         <w:t xml:space="preserve"> </w:t>
       </w:r>
-      <w:hyperlink r:id="rId68">
+      <w:hyperlink r:id="rId70">
         <w:r>
           <w:rPr>
             <w:rStyle w:val="Hyperlink"/>
@@ -11805,7 +11925,7 @@
       <w:r>
         <w:t xml:space="preserve"> </w:t>
       </w:r>
-      <w:hyperlink r:id="rId69">
+      <w:hyperlink r:id="rId71">
         <w:r>
           <w:rPr>
             <w:rStyle w:val="Hyperlink"/>
@@ -11822,17 +11942,18 @@
     </w:p>
     <w:p>
       <w:pPr>
-        <w:pStyle w:val="BodyText"/>
-      </w:pPr>
-      <w:r>
-        <w:rPr>
-          <w:b/>
-        </w:rPr>
+        <w:pStyle w:val="Heading2"/>
+      </w:pPr>
+      <w:bookmarkStart w:id="72" w:name="samir-chincholikar"/>
+      <w:r>
         <w:t xml:space="preserve">Samir Chincholikar</w:t>
       </w:r>
-      <w:r>
-        <w:t xml:space="preserve"> </w:t>
-      </w:r>
+      <w:bookmarkEnd w:id="72"/>
+    </w:p>
+    <w:p>
+      <w:pPr>
+        <w:pStyle w:val="FirstParagraph"/>
+      </w:pPr>
       <w:r>
         <w:t xml:space="preserve">received the B.E. degree from the University of Mumbai, India, in 2013, the</w:t>
       </w:r>
@@ -11887,17 +12008,18 @@
     </w:p>
     <w:p>
       <w:pPr>
-        <w:pStyle w:val="BodyText"/>
-      </w:pPr>
-      <w:r>
-        <w:rPr>
-          <w:b/>
-        </w:rPr>
+        <w:pStyle w:val="Heading2"/>
+      </w:pPr>
+      <w:bookmarkStart w:id="73" w:name="robin-chawla"/>
+      <w:r>
         <w:t xml:space="preserve">Robin Chawla</w:t>
       </w:r>
-      <w:r>
-        <w:t xml:space="preserve"> </w:t>
-      </w:r>
+      <w:bookmarkEnd w:id="73"/>
+    </w:p>
+    <w:p>
+      <w:pPr>
+        <w:pStyle w:val="FirstParagraph"/>
+      </w:pPr>
       <w:r>
         <w:t xml:space="preserve">received the B.Tech. degree in computer science and engineering from the Indian</w:t>
       </w:r>

</xml_diff>

<commit_message>
Humanize manuscript prose (numbers/citations unchanged); rebuild PDF/DOCX; add SSRN neutral-preprint package
</commit_message>
<xml_diff>
--- a/paper/main.docx
+++ b/paper/main.docx
@@ -1645,7 +1645,7 @@
         <w:pStyle w:val="FirstParagraph"/>
       </w:pPr>
       <w:r>
-        <w:t xml:space="preserve">Large language models (LLMs) are increasingly incorporated into financial decision-support workflows [21, 22], including credit screening, counterparty assessment, disclosure review, and operational triage. In these applications, model outputs may influence downstream classifications, escalation decisions, or review priorities. Unlike conventional institution-developed models governed under established model-risk frameworks [7, 8], however, many LLMs are accessed through third-party application programming interfaces whose underlying model versions are controlled by the provider. When an incumbent version is deprecated or replaced, institutions may be required to migrate even when their prompts, data, and downstream processes remain unchanged.</w:t>
+        <w:t xml:space="preserve">Large language models (LLMs) are increasingly being integrated into financial decision-support workflows [21, 22] such as credit screening, counterparty assessment, disclosure review, and operational triage. In these applications, model outputs can feed into downstream classifications, escalation decisions, and review priorities. However, many LLMs are accessed via application programming interfaces (APIs) provided by third parties, in which case the provider determines the versions and availability of the underlying models. This differs from conventional models developed within an institution and governed by existing model-risk processes [7, 8]. When an existing model version is deprecated or replaced, institutions may therefore be forced to migrate to a successor version even if their prompts, data, application logic, and downstream processes remain unchanged.</w:t>
       </w:r>
     </w:p>
     <w:p>
@@ -1653,7 +1653,7 @@
         <w:pStyle w:val="BodyText"/>
       </w:pPr>
       <w:r>
-        <w:t xml:space="preserve">Such migrations create a distinct form of model-change risk. A successor version may preserve the behavior of its predecessor, in which case migration has limited operational consequence. Alternatively, differences in training data, architecture, optimization, or alignment may cause the same inputs to receive materially different decisions [1, 2, 19]. The size, direction, and structure of this discontinuity cannot be inferred from the fact that a provider designates one version as the recommended replacement for another [24]. It must be measured empirically under controlled input and sampling conditions.</w:t>
+        <w:t xml:space="preserve">These migrations are a distinct form of model-change risk. A successor version could act like its predecessor, with little impact on operations. But the same inputs can also lead to materially different decisions depending on changes in training data, architecture, optimization, or alignment [1, 2, 19]. Just because a provider marks a version as the recommended replacement does not mean that it is behaviorally equivalent to its predecessor [24]. The magnitude, direction, and structure of any resulting decision changes thus have to be empirically measured under controlled input and sampling conditions.</w:t>
       </w:r>
     </w:p>
     <w:p>
@@ -1661,7 +1661,7 @@
         <w:pStyle w:val="BodyText"/>
       </w:pPr>
       <w:r>
-        <w:t xml:space="preserve">Existing evaluations of model updates face two measurement challenges. First, repeated calls to the same model version may produce different outputs because of residual sampling variability. A raw before-and-after disagreement rate may therefore attribute ordinary within-version variation to the migration itself. Second, an aggregate flip rate does not reveal how the change occurs. A successor may alter the overall distribution of labels across the evaluated portfolio, or it may reconsider individual companies while leaving the aggregate distribution approximately unchanged. These mechanisms have different operational and governance implications and should be measured separately.</w:t>
+        <w:t xml:space="preserve">There are two main measurement challenges in model update evaluation. First, repeated calls to the same model version can yield different outputs because of residual sampling variability. Therefore, a simple before-and-after disagreement rate may mistakenly attribute normal within-version variation to the migration itself. Second, the aggregate flip rate does not capture how decisions are changing. A successor version may change the overall distribution of labels across the portfolio being evaluated, or it may move individual companies in offsetting directions with little change in the aggregate distribution. These two types of changes have different operational and governance implications and should therefore be measured separately.</w:t>
       </w:r>
     </w:p>
     <w:p>
@@ -1669,7 +1669,7 @@
         <w:pStyle w:val="BodyText"/>
       </w:pPr>
       <w:r>
-        <w:t xml:space="preserve">This study evaluates two vendor-declared model migrations on a controlled financial classification task. Each incumbent and successor version receives identical, dated financial information and matched per-cell sampling seeds. Within-version replicate disagreement is used to estimate the ordinary noise floor, and the primary endpoint measures the cross-version flip rate in excess of that baseline. We further decompose observed migration changes into a marginal label-distribution shift and per-company churn, assess directional movement across credit-health categories, and compare both versions with a deterministic, rule-based Altman</w:t>
+        <w:t xml:space="preserve">This study assesses two vendor model migrations using a controlled financial classification task. For each migration, the incumbent and successor versions receive identical dated financial information and matched cell-level sampling seeds. We estimate the ordinary noise floor using within-version replicate disagreement and measure the cross-version flip rate in excess of this baseline as the primary endpoint. We further decompose the observed migration-induced changes into a marginal label-distribution shift and company-level churn, examine directional movement between credit-health categories, and perform a secondary analysis comparing both versions against a deterministic, rule-based Altman</w:t>
       </w:r>
       <w:r>
         <w:t xml:space="preserve"> </w:t>
@@ -1683,7 +1683,7 @@
         </m:r>
       </m:oMath>
       <w:r>
-        <w:t xml:space="preserve">-based reference proxy [11, 12].</w:t>
+        <w:t xml:space="preserve">-based financial-health reference [11, 12].</w:t>
       </w:r>
     </w:p>
     <w:p>
@@ -1691,7 +1691,7 @@
         <w:pStyle w:val="BodyText"/>
       </w:pPr>
       <w:r>
-        <w:t xml:space="preserve">The paper focuses on deployment-level migration risk: the possibility that a provider-controlled update materially changes decisions within an otherwise fixed LLM pipeline. Because deployments using the same version encounter the same vendor-initiated transition, this mechanism can create synchronized changes across systems pinned to that version [3, 4, 5, 6]. The study does not measure realized cross-institution or market-level effects; instead, it provides controlled evidence that the underlying decision-shock mechanism exists and can be quantified. In this study,</w:t>
+        <w:t xml:space="preserve">This paper focuses on migration risk at the deployment level: the possibility that a provider-controlled update materially changes decisions within an otherwise unchanged LLM pipeline. When a particular model version is used by multiple deployments, they may undergo the same vendor-initiated change around the same time, resulting in synchronized changes across these systems [3, 4, 5, 6]. We term this common upstream version change and its potential to affect multiple deployments a</w:t>
       </w:r>
       <w:r>
         <w:t xml:space="preserve"> </w:t>
@@ -1700,7 +1700,7 @@
         <w:t xml:space="preserve">“</w:t>
       </w:r>
       <w:r>
-        <w:t xml:space="preserve">correlated shock</w:t>
+        <w:t xml:space="preserve">correlated shock.</w:t>
       </w:r>
       <w:r>
         <w:t xml:space="preserve">”</w:t>
@@ -1709,7 +1709,7 @@
         <w:t xml:space="preserve"> </w:t>
       </w:r>
       <w:r>
-        <w:t xml:space="preserve">denotes a common upstream version change capable of affecting multiple deployments at approximately the same time; it does not denote an empirical estimate of cross-institutional correlation.</w:t>
+        <w:t xml:space="preserve">It does not imply an empirical measurement of cross-institutional correlations or realized effects at the market level. Instead, this research provides controlled evidence that the underlying mechanism for such a shared decision shock exists and is quantifiable.</w:t>
       </w:r>
     </w:p>
     <w:p>
@@ -1737,7 +1737,7 @@
         <w:t xml:space="preserve"> </w:t>
       </w:r>
       <w:r>
-        <w:t xml:space="preserve">We provide a preregistered evaluation of two real vendor migrations using an explicit within-version noise floor to distinguish update effects from ordinary sampling variability.</w:t>
+        <w:t xml:space="preserve">We quantify the decision instability associated with two vendor model migrations using an explicit within-version noise floor to separate migration-induced disagreement from normal sampling variability.</w:t>
       </w:r>
     </w:p>
     <w:p>
@@ -1757,7 +1757,7 @@
         <w:t xml:space="preserve"> </w:t>
       </w:r>
       <w:r>
-        <w:t xml:space="preserve">We separate migration-induced changes into marginal label-distribution shifts and per-company churn and report complementary chance-corrected agreement and directional-drift statistics.</w:t>
+        <w:t xml:space="preserve">We decompose migration-induced decision changes into marginal label-distribution shifts and company-level churn, and use chance-corrected agreement and directional-drift measures to further characterize the structure of these changes.</w:t>
       </w:r>
     </w:p>
     <w:p>
@@ -1777,7 +1777,7 @@
         <w:t xml:space="preserve"> </w:t>
       </w:r>
       <w:r>
-        <w:t xml:space="preserve">We evaluate whether the decisions changed by each migration are associated with improved classification quality against a deterministic, rule-based financial-health reference proxy.</w:t>
+        <w:t xml:space="preserve">We evaluate whether the decisions changed by each model migration are associated with improved classification performance against a deterministic, rule-based financial-health reference.</w:t>
       </w:r>
     </w:p>
     <w:p>
@@ -1797,7 +1797,7 @@
         <w:t xml:space="preserve"> </w:t>
       </w:r>
       <w:r>
-        <w:t xml:space="preserve">We translate the empirical measurements into a pre-migration parallel-run control that can detect material decision changes before production cutover.</w:t>
+        <w:t xml:space="preserve">We convert the empirical measurements into a pre-migration parallel-run control that can identify material decision changes before production cutover.</w:t>
       </w:r>
     </w:p>
     <w:p>
@@ -1817,7 +1817,7 @@
         <w:t xml:space="preserve"> </w:t>
       </w:r>
       <w:r>
-        <w:t xml:space="preserve">We provide frozen inputs, exact model-version identifiers, matched seeds, raw responses, preregistration materials, and a deterministic analysis pipeline that regenerates the reported results.</w:t>
+        <w:t xml:space="preserve">We release frozen inputs, exact model-version identifiers, matched seeds, raw model responses, preregistration materials, and a deterministic analysis pipeline that reproduces the reported results.</w:t>
       </w:r>
     </w:p>
     <w:p>
@@ -1845,7 +1845,7 @@
         <w:pStyle w:val="FirstParagraph"/>
       </w:pPr>
       <w:r>
-        <w:t xml:space="preserve">Model updates can alter predictions even when task inputs and downstream decision rules remain unchanged. Prior work describes such instance-level regressions as negative flips, in which a successor model overturns a previously correct or stable prediction. MUSCLE examines this problem in LLM evolution and proposes compatibility mechanisms intended to reduce regressions between model versions [1], paralleling regression-free update objectives developed for vision models [26]. Related work on concept drift distinguishes genuine model changes from ordinary within-model variability [25], while standardized, holistic model-evaluation frameworks emphasize the need to evaluate successor versions before deployment [20]. Studies of task underspecification further show that apparently fixed prompts may leave substantial behavioral discretion to the underlying model [2, 27], allowing updates to change responses along dimensions not explicitly constrained by the prompt.</w:t>
+        <w:t xml:space="preserve">Even if the task inputs and downstream decision rules remain the same, model updates can alter predictions. In prior work, such instance-level regressions are referred to as negative flips, where a successor model overturns a previously correct or stable prediction. Work on LLM evolution has tackled this problem by proposing compatibility mechanisms to reduce regressions across model versions [1], building on prior work on regression-free model updates [26]. Related work in concept drift research distinguishes true changes in model behavior from normal within-model variability [25], while standardized model-evaluation frameworks emphasize the importance of assessing successor models before deployment [20]. Task underspecification studies also demonstrate that seemingly fixed prompts can provide significant behavioral freedom to the underlying model [2, 27], allowing version updates to affect responses along dimensions that are not explicitly constrained by the prompt.</w:t>
       </w:r>
     </w:p>
     <w:p>
@@ -1853,7 +1853,7 @@
         <w:pStyle w:val="BodyText"/>
       </w:pPr>
       <w:r>
-        <w:t xml:space="preserve">These studies primarily frame update regression as a model-performance, compatibility, or deployment-engineering problem. The present study examines a complementary question: how much a vendor-declared version migration changes categorical financial decisions after ordinary within-version response variability is removed. Rather than focusing only on whether individual predictions improve or deteriorate, we measure the aggregate decision discontinuity, its directional structure, and the mechanism through which the portfolio of classifications changes. This extends model-update research from instance-level compatibility to the operational risk created when a provider-controlled migration affects an otherwise unchanged financial decision pipeline.</w:t>
+        <w:t xml:space="preserve">Previous work mostly casts model-update regression as a problem of model performance, compatibility, or deployment engineering. The question addressed in the present study is a complementary one: how much does a vendor-directed version migration change categorical financial decisions after accounting for normal within-version response variability? Rather than looking only at the improvement or deterioration of individual predictions, we also measure the overall decision discontinuity, its directional structure, and the changes in the portfolio of classifications. This extends model-update research from instance-level compatibility to the operational risk arising from a provider-controlled migration that affects an otherwise unchanged financial decision pipeline.</w:t>
       </w:r>
     </w:p>
     <w:p>
@@ -1871,7 +1871,7 @@
         <w:pStyle w:val="FirstParagraph"/>
       </w:pPr>
       <w:r>
-        <w:t xml:space="preserve">A growing literature examines the possibility that widespread reliance on similar artificial intelligence systems may create correlated behavior across financial institutions and markets. Shared foundation models, common training data, and similar optimization objectives may cause otherwise independent users to produce aligned decisions, thereby reducing effective model diversity and increasing susceptibility to common failures [23, 3]. Related work has linked such convergence to algorithmic herding, concentration risk, and broader forms of systemic fragility [4, 5], while supervisory research has begun to identify AI homogenization as a potential source of correlated financial risk [6, 28].</w:t>
+        <w:t xml:space="preserve">More and more studies investigate whether widespread reliance on similar artificial intelligence systems can lead to correlated behavior across financial institutions and markets. Shared foundation models, common training data, and similar optimization objectives may cause otherwise independent users to make increasingly aligned decisions, reducing effective model diversity and increasing exposure to common failures [23, 3]. Related studies have linked this convergence to algorithmic herding, concentration risk, and broader forms of systemic fragility [4, 5]. Supervisory research has also begun to identify AI homogenization as a possible source of correlated risk in the financial system [6, 28].</w:t>
       </w:r>
     </w:p>
     <w:p>
@@ -1879,7 +1879,7 @@
         <w:pStyle w:val="BodyText"/>
       </w:pPr>
       <w:r>
-        <w:t xml:space="preserve">Most existing work addresses this concern conceptually or through market-level models of correlated trading and decision behavior. The empirical mechanism through which a common external change could simultaneously alter deployed decisions remains less directly measured. A vendor-controlled version migration provides one such mechanism: multiple deployments pinned to the same model version may encounter the same successor model and therefore experience a synchronized change in behavior. The present study evaluates this mechanism at the decision level by measuring how two vendor migrations alter fixed, graded credit-health classifications under identical inputs.</w:t>
+        <w:t xml:space="preserve">Most of the existing work has taken a conceptual or market-level approach to the problem of correlated trading and decision behavior. However, less direct empirical evidence exists on how a common external change might simultaneously influence decisions across deployed systems. One such mechanism is a vendor-managed model-version migration, where several deployments using the same model version can be exposed to the same successor and thus undergo a synchronized behavioral change. In this paper, we measure the effect of two vendor migrations on credit-health classifications under identical inputs and thus assess this mechanism at the decision level.</w:t>
       </w:r>
     </w:p>
     <w:p>
@@ -1887,7 +1887,7 @@
         <w:pStyle w:val="BodyText"/>
       </w:pPr>
       <w:r>
-        <w:t xml:space="preserve">The analysis does not estimate realized systemic effects or cross-institution losses. Instead, the study establishes a mechanism through which deployments using the shared version could experience a common behavioral change. This decision-level evidence complements the systemic-risk literature by connecting abstract concerns about model concentration to a measurable operational event within an LLM-based financial workflow.</w:t>
+        <w:t xml:space="preserve">This analysis does not estimate realized systemic effects or cross-institutional losses. Instead, it identifies a mechanism through which deployments based on the same model version could experience a shared change in behavior. This evidence at the decision level contributes to the existing systemic-risk literature by linking broader concerns about model concentration to a measurable operational event in an LLM-based financial workflow.</w:t>
       </w:r>
     </w:p>
     <w:p>
@@ -1905,7 +1905,7 @@
         <w:pStyle w:val="FirstParagraph"/>
       </w:pPr>
       <w:r>
-        <w:t xml:space="preserve">Categorical agreement between an incumbent and successor model can be measured using chance-corrected statistics such as Cohen’s</w:t>
+        <w:t xml:space="preserve">Chance-corrected measures of agreement between an incumbent and successor model include Cohen’s</w:t>
       </w:r>
       <w:r>
         <w:t xml:space="preserve"> </w:t>
@@ -1927,7 +1927,21 @@
         </m:r>
       </m:oMath>
       <w:r>
-        <w:t xml:space="preserve"> [14], and Gwet’s AC1 [10] (with Fleiss’ generalization to multiple raters [15]). In this study, the two model versions are treated as paired raters that assign one of three credit-health labels (SAFE, WATCH, or DISTRESS) to the same company-date-replicate cells. These statistics summarize the extent to which the two versions produce consistent classifications beyond the level expected from their marginal label distributions.</w:t>
+        <w:t xml:space="preserve"> [14], and Gwet’s AC1 [10], with Fleiss’</w:t>
+      </w:r>
+      <w:r>
+        <w:t xml:space="preserve"> </w:t>
+      </w:r>
+      <m:oMath>
+        <m:r>
+          <m:t>κ</m:t>
+        </m:r>
+      </m:oMath>
+      <w:r>
+        <w:t xml:space="preserve"> </w:t>
+      </w:r>
+      <w:r>
+        <w:t xml:space="preserve">providing a generalization to multiple raters [15]. In this study, we treat the incumbent and successor model versions as paired raters that assign one of three credit-health labels (SAFE, WATCH, or DISTRESS) to the same company-date-replicate cells. These measures capture the extent to which the two versions agree in their classifications beyond the agreement expected from their marginal label distributions.</w:t>
       </w:r>
     </w:p>
     <w:p>
@@ -1935,7 +1949,7 @@
         <w:pStyle w:val="BodyText"/>
       </w:pPr>
       <w:r>
-        <w:t xml:space="preserve">Reliance on a single agreement statistic can be misleading when category prevalence is highly uneven or changes materially across versions. Cohen’s</w:t>
+        <w:t xml:space="preserve">If category prevalence is very uneven, or if the prevalence shifts substantially between model versions, relying on a single agreement statistic can be misleading. Cohen’s</w:t>
       </w:r>
       <w:r>
         <w:t xml:space="preserve"> </w:t>
@@ -1949,7 +1963,7 @@
         <w:t xml:space="preserve"> </w:t>
       </w:r>
       <w:r>
-        <w:t xml:space="preserve">and related measures may decline even when raw agreement remains substantial, a behavior commonly described as the</w:t>
+        <w:t xml:space="preserve">and related statistics can be low even in the presence of high observed agreement, a phenomenon often called the</w:t>
       </w:r>
       <w:r>
         <w:t xml:space="preserve"> </w:t>
@@ -1977,7 +1991,7 @@
         <w:t xml:space="preserve"> </w:t>
       </w:r>
       <w:r>
-        <w:t xml:space="preserve">provides an additional chance-corrected comparison under a different expected-agreement formulation. Reporting all three statistics therefore allows the observed migration effect to be assessed for robustness to alternative treatments of marginal imbalance.</w:t>
+        <w:t xml:space="preserve">is an alternative chance-corrected measure based on a different formulation of expected agreement. We report all three measures to evaluate whether the observed migration effect persists under different treatments of marginal label imbalance.</w:t>
       </w:r>
     </w:p>
     <w:p>
@@ -1985,7 +1999,7 @@
         <w:pStyle w:val="BodyText"/>
       </w:pPr>
       <w:r>
-        <w:t xml:space="preserve">Agreement statistics alone, however, do not identify how a migration changes the portfolio of decisions. A low cross-version agreement value may result from a broad shift in label prevalence, from offsetting company-level reclassifications that leave the aggregate label mix largely unchanged, or from a combination of both. We therefore complement the agreement measures with an explicit prevalence–churn decomposition. The marginal component measures the minimum share of observations that must change to produce the successor version’s label distribution, while the remaining churn component captures company-level reshuffling that cancels in aggregate.</w:t>
+        <w:t xml:space="preserve">Agreement statistics alone, however, do not explain how the portfolio of decisions changes under a model migration. Low agreement across versions may result from a large shift in label prevalence, from offsetting company-level reclassifications that leave the aggregate label distribution largely unchanged, or from both. We therefore supplement the agreement measures with a prevalence–churn decomposition. The marginal component is the minimum proportion of observations that must change to produce the label distribution of the successor version, while the remaining churn component captures company-level reclassifications that cancel out in the aggregate.</w:t>
       </w:r>
     </w:p>
     <w:p>
@@ -1993,7 +2007,7 @@
         <w:pStyle w:val="BodyText"/>
       </w:pPr>
       <w:r>
-        <w:t xml:space="preserve">This combined framework separates three related but distinct quantities: overall cross-version consistency, distributional movement across credit-health categories, and genuine reclassification of individual companies. It therefore provides a more informative characterization of migration behavior than either raw flip rates or a single chance-corrected agreement statistic alone.</w:t>
+        <w:t xml:space="preserve">These measures together capture three related but distinct aspects of model migration: consistency across versions, changes in the distribution of credit-health categories, and reclassification of individual firms. This provides a more informative picture of migration behavior than a raw flip rate or a single chance-corrected agreement statistic alone.</w:t>
       </w:r>
     </w:p>
     <w:p>
@@ -2011,7 +2025,7 @@
         <w:pStyle w:val="FirstParagraph"/>
       </w:pPr>
       <w:r>
-        <w:t xml:space="preserve">Model-risk management frameworks emphasize validation, ongoing monitoring, change control, documentation, effective challenge, and institutional accountability for third-party models. In the United States, SR 11-7 historically established these expectations, but its lifecycle largely assumes that an institution can identify when a model changes and initiate review before the modified model enters production [7].</w:t>
+        <w:t xml:space="preserve">Model-risk management frameworks emphasize validation, ongoing monitoring, change control, documentation, effective challenge, and institutional accountability, including for third-party models. Historically, SR 11-7 has been the benchmark for these expectations in the United States, but its model lifecycle typically assumes that an institution can identify when a model has changed and initiate a review before the modified model is put into production [7].</w:t>
       </w:r>
     </w:p>
     <w:p>
@@ -2019,7 +2033,7 @@
         <w:pStyle w:val="BodyText"/>
       </w:pPr>
       <w:r>
-        <w:t xml:space="preserve">Vendor-hosted LLMs complicate this assumption because model versions may be updated, replaced, or deprecated according to the provider’s schedule. A migration can therefore alter model behavior even when the institution holds its prompts, inputs, application logic, and downstream controls fixed. Recent research has proposed broader governance approaches for generative and agentic AI [9], but the present study addresses a narrower empirical problem: decision discontinuity caused specifically by vendor-directed model-version migration. We operationalize this risk through paired version testing, a within-version noise floor, and measures of excess disagreement, distributional shift, churn, and directional drift. The corresponding supervisory implications and proposed control are developed in Section </w:t>
+        <w:t xml:space="preserve">This assumption is complicated by vendor-hosted LLMs, where model versions may be updated, replaced, or deprecated on the provider’s schedule. Hence, a migration can change model behavior even as an institution maintains its prompts, inputs, application logic, and downstream controls. Recent work has proposed broader governance frameworks for generative and agentic AI [9], but the present study focuses on a narrower empirical problem: decision discontinuity caused specifically by vendor-directed model-version migration. To measure this risk, we use paired version testing, a within-version noise floor, and measures of excess disagreement, distributional shift, churn, and directional drift. The corresponding governance implications and proposed control are developed in Section </w:t>
       </w:r>
       <w:hyperlink w:anchor="sec:gov">
         <w:r>
@@ -2048,7 +2062,7 @@
         <w:pStyle w:val="FirstParagraph"/>
       </w:pPr>
       <w:r>
-        <w:t xml:space="preserve">Empirical LLM evaluations are sensitive to model versions, prompts, sampling settings, data selection, exclusion rules, and statistical choices [31], while proprietary endpoint changes may prevent exact retrospective replay. We therefore specify the migration pairs, evaluation grid, prompt, seeds, endpoints, reference-label procedure, and decision rule before confirmatory data collection [30]; assign the frozen protocol a cryptographic hash; preserve immutable call-level responses and configurations; and regenerate all reported results through a seeded, build-validated analysis pipeline [32]. The archived responses, rather than future API replay, constitute the empirical record. Full procedural details are provided in Section </w:t>
+        <w:t xml:space="preserve">Empirical LLM evaluations are sensitive to model versions, prompts, sampling settings, data selection, exclusion rules, and statistical choices [31], and proprietary endpoints may change, making exact retrospective replay difficult or impossible. We therefore specify the migration pairs, evaluation grid, prompt, seeds, endpoints, reference-label procedure, and decision rule before confirmatory data collection [30]; assign the frozen protocol a cryptographic hash; preserve immutable call-level responses and configurations; and reproduce all reported results through a seeded, build-validated analysis pipeline [32]. The empirical record of the experiment is the archived responses, not future replays of the API. Full procedural details are provided in Section </w:t>
       </w:r>
       <w:hyperlink w:anchor="subsec:freeze">
         <w:r>
@@ -2335,7 +2349,7 @@
         <w:pStyle w:val="FirstParagraph"/>
       </w:pPr>
       <w:r>
-        <w:t xml:space="preserve">The model response is required to follow a fixed JSON schema containing the categorical label, a self-reported conviction score, and a free-text rationale. The categorical label is the output used in the present analysis.</w:t>
+        <w:t xml:space="preserve">Each response is returned in a fixed JSON schema containing the assigned categorical label, a self-reported conviction score, and a free-text rationale. In the analysis presented here, only the categorical label is used.</w:t>
       </w:r>
     </w:p>
     <w:p>
@@ -2343,7 +2357,7 @@
         <w:pStyle w:val="BodyText"/>
       </w:pPr>
       <w:r>
-        <w:t xml:space="preserve">The experimental comparison is paired. For every valid cell, the incumbent and successor versions are evaluated using identical financial inputs, prompt structure, inference settings, and matched cell-level seeds. Consequently, the model version is the principal experimental factor that varies between the two observations in each pair.</w:t>
+        <w:t xml:space="preserve">The experimental comparison uses a paired design. For every valid cell, the incumbent and successor versions are evaluated using identical financial inputs, prompt structure, inference settings, and matched cell-level seeds. Model version is thus the main experimental factor that differs between the two observations in each pair.</w:t>
       </w:r>
     </w:p>
     <w:p>
@@ -2351,7 +2365,7 @@
         <w:pStyle w:val="BodyText"/>
       </w:pPr>
       <w:r>
-        <w:t xml:space="preserve">The primary estimand is not whether either version produces the correct financial classification. Instead, it is the extent to which replacing</w:t>
+        <w:t xml:space="preserve">The primary estimand is not whether either version produces the correct financial classification. Instead, it is how much replacing</w:t>
       </w:r>
       <w:r>
         <w:t xml:space="preserve"> </w:t>
@@ -2427,7 +2441,7 @@
         <w:t xml:space="preserve"> </w:t>
       </w:r>
       <w:r>
-        <w:t xml:space="preserve">changes the categorical decision produced by an otherwise unchanged pipeline. Reference labels are introduced separately for the secondary accuracy analysis and are not required to estimate migration-induced decision instability.</w:t>
+        <w:t xml:space="preserve">changes the categorical decision of an otherwise unchanged pipeline. Reference labels are introduced separately for the secondary accuracy analysis and are not required to estimate the decision instability induced by migration.</w:t>
       </w:r>
     </w:p>
     <w:p>
@@ -2445,7 +2459,7 @@
         <w:pStyle w:val="FirstParagraph"/>
       </w:pPr>
       <w:r>
-        <w:t xml:space="preserve">A raw comparison between</w:t>
+        <w:t xml:space="preserve">A naive comparison between</w:t>
       </w:r>
       <w:r>
         <w:t xml:space="preserve"> </w:t>
@@ -2521,7 +2535,7 @@
         <w:t xml:space="preserve"> </w:t>
       </w:r>
       <w:r>
-        <w:t xml:space="preserve">may overstate migration-induced instability because repeated calls to the same model version can produce different labels under identical inputs. We therefore separate ordinary within-version variability from the additional disagreement introduced by the version change.</w:t>
+        <w:t xml:space="preserve">can overstate the apparent instability due to migration, because multiple calls to the same model version may produce different labels given the same input. We therefore separate ordinary within-version variability from the additional disagreement introduced by the version change.</w:t>
       </w:r>
     </w:p>
     <w:p>
@@ -3377,7 +3391,7 @@
         <w:pStyle w:val="FirstParagraph"/>
       </w:pPr>
       <w:r>
-        <w:t xml:space="preserve">This quantity is the cross-version disagreement rate in excess of the estimated within-version noise floor. It quantifies how much more the incumbent and successor versions disagree than repeated invocations of a single version, and we interpret it as a noise-adjusted measure of cross-version disagreement rather than a formal identification of the causal share of decisions changed by the migration. A positive value indicates that the two versions disagree more than ordinary within-version sampling variability alone would produce.</w:t>
+        <w:t xml:space="preserve">This is the cross-version disagreement rate above the estimated within-version noise floor. It quantifies how much more the incumbent and successor versions disagree than repeated calls to a single version, and we view it as a noise-adjusted measure of cross-version disagreement rather than a formal estimate of the causal share of decisions changed by the migration. A positive value indicates that the two versions disagree more than ordinary within-version sampling variability alone would produce.</w:t>
       </w:r>
     </w:p>
     <w:p>
@@ -3690,7 +3704,7 @@
         <w:pStyle w:val="FirstParagraph"/>
       </w:pPr>
       <w:r>
-        <w:t xml:space="preserve">The pooled estimator is used as the primary measure, while the maximum-floor specification serves as a stricter sensitivity analysis. The migration effect is considered supported when the estimated excess flip rate is positive and its 95% confidence interval excludes zero.</w:t>
+        <w:t xml:space="preserve">The pooled estimator is used as the primary measure, while the maximum-floor specification provides a stricter sensitivity analysis. We consider the migration effect to be supported when the estimated excess flip rate is positive and its 95% confidence interval excludes zero.</w:t>
       </w:r>
     </w:p>
     <w:p>
@@ -4008,7 +4022,7 @@
         <w:pStyle w:val="FirstParagraph"/>
       </w:pPr>
       <w:r>
-        <w:t xml:space="preserve">This quantity represents the minimum fraction of observations that must change labels to transform the incumbent version’s aggregate label distribution into that of the successor version. It therefore captures portfolio-level re-rating attributable to a change in category prevalence.</w:t>
+        <w:t xml:space="preserve">This is the minimum fraction of observations that must change labels to transform the incumbent version’s aggregate label distribution into that of the successor version. It therefore captures portfolio-level re-rating attributable to a change in category prevalence.</w:t>
       </w:r>
     </w:p>
     <w:p>
@@ -4140,7 +4154,7 @@
         <w:pStyle w:val="FirstParagraph"/>
       </w:pPr>
       <w:r>
-        <w:t xml:space="preserve">Churn captures additional company-level reclassifications that offset one another in the aggregate. For example, a movement from SAFE to WATCH for one company and a movement from WATCH to SAFE for another increase churn while leaving the overall category shares unchanged.</w:t>
+        <w:t xml:space="preserve">Churn captures additional company-level reclassifications that offset one another in the aggregate. For example, if one company moves from SAFE to WATCH and another moves from WATCH to SAFE, churn increases even though the overall category shares remain unchanged.</w:t>
       </w:r>
     </w:p>
     <w:p>
@@ -4250,7 +4264,7 @@
         <w:t xml:space="preserve"> </w:t>
       </w:r>
       <w:r>
-        <w:t xml:space="preserve">measures residual company-level reshuffling. A migration is described as marginal-dominated when</w:t>
+        <w:t xml:space="preserve">measures residual company-level reshuffling. We call a migration marginal-dominated when</w:t>
       </w:r>
       <w:r>
         <w:t xml:space="preserve"> </w:t>
@@ -4677,7 +4691,7 @@
         <w:t xml:space="preserve"> </w:t>
       </w:r>
       <w:r>
-        <w:t xml:space="preserve">for the corresponding cell. This matched-seed design holds the nominal sampling condition fixed across versions, so that model version is the principal factor that differs within each comparison. The experimental logs verify that no seed mismatches occurred across the matched migration pairs. Because vendor seed support is best-effort rather than a guarantee of deterministic output, residual stochasticity is measured empirically through the within-version noise floor defined in Section </w:t>
+        <w:t xml:space="preserve">for the corresponding cell. This matched-seed design holds the nominal sampling condition fixed across versions, so that model version is the principal factor that differs within each comparison. The experimental logs confirm that no seed mismatches occurred across the matched migration pairs. Because vendor seed support is best-effort rather than a guarantee of deterministic output, residual stochasticity is measured empirically through the within-version noise floor defined in Section </w:t>
       </w:r>
       <w:hyperlink w:anchor="subsec:noisefloor">
         <w:r>
@@ -4696,7 +4710,7 @@
         <w:pStyle w:val="BodyText"/>
       </w:pPr>
       <w:r>
-        <w:t xml:space="preserve">Only cells with valid categorical outputs from both the incumbent and successor versions are included in the paired cross-version analysis. This matched-pair requirement ensures that the flip rate, transition matrix, agreement statistics, and directional tests are computed from identical evaluation units. Call failures and invalid responses are reported separately so that any difference in matched sample size remains auditable.</w:t>
+        <w:t xml:space="preserve">The paired cross-version analysis includes only cells with valid categorical outputs from both the incumbent and successor versions. This matched-pair requirement ensures that the flip rate, transition matrix, agreement statistics, and directional tests are computed from identical evaluation units. Call failures and invalid responses are reported separately so that any difference in matched sample size remains auditable.</w:t>
       </w:r>
     </w:p>
     <w:p>
@@ -4817,7 +4831,7 @@
         <w:pStyle w:val="FirstParagraph"/>
       </w:pPr>
       <w:r>
-        <w:t xml:space="preserve">The confirmatory experiment evaluates two vendor-declared model-version migrations over a common financial-classification grid. The grid contains 100 large-cap companies distributed across all 11 Global Industry Classification Standard sectors, twelve as-of dates in 2026, and three replicate calls for each company–date combination. The twelve as-of dates are 2026-01-09, 2026-01-23, 2026-02-06, 2026-02-20, 2026-03-06, 2026-03-20, 2026-04-03, 2026-04-17, 2026-05-01, 2026-05-15, 2026-05-22, and 2026-05-29; they span 9 January to 29 May 2026 at approximately two-week intervals, with the final three dates one week apart.</w:t>
+        <w:t xml:space="preserve">The confirmatory experiment evaluates two vendor-declared model-version migrations over a common financial-classification grid. The grid contains 100 large-cap companies distributed across all 11 Global Industry Classification Standard (GICS) sectors, twelve as-of dates in 2026, and three replicate calls for each company–date combination. The twelve as-of dates are 2026-01-09, 2026-01-23, 2026-02-06, 2026-02-20, 2026-03-06, 2026-03-20, 2026-04-03, 2026-04-17, 2026-05-01, 2026-05-15, 2026-05-22, and 2026-05-29; they span 9 January to 29 May 2026 at approximately two-week intervals, with the final three dates one week apart.</w:t>
       </w:r>
     </w:p>
     <w:p>
@@ -4933,7 +4947,7 @@
         <w:pStyle w:val="BodyText"/>
       </w:pPr>
       <w:r>
-        <w:t xml:space="preserve">The company universe is a fixed, prespecified list of 100 large-capitalization U.S.-listed companies, enumerated in the released study configuration and stratified across all 11 GICS sectors (between 8 and 10 companies per sector); the identical list is used for both migrations to support direct comparison of the magnitude and structure of version-induced changes. The set was curated to cover prominent large-capitalization constituents of each GICS sector rather than drawn programmatically from a named index on a fixed selection date; accordingly, no index-membership date or market-capitalization threshold is claimed. The exact constituents are released in full in the study configuration, so the universe is fully specified and reproducible even though it is not derived from a single external index. The analysis dates are also shared across versions within each migration pair. Each replicate is treated as a distinct model invocation with a matched seed across the incumbent and successor versions.</w:t>
+        <w:t xml:space="preserve">The company universe is a fixed, prespecified list of 100 large-capitalization U.S.-listed companies, enumerated in the released study configuration and stratified across all 11 GICS sectors (between 8 and 10 companies per sector); the same list is used for both migrations to allow a direct comparison of the magnitude and structure of the version-induced changes. Companies were chosen as prominent large-capitalization constituents of each GICS sector rather than drawn programmatically from a named index on a fixed selection date; accordingly, no index-membership date or market-capitalization threshold is claimed. The exact constituents are released in full in the study configuration, so the universe is fully specified and reproducible even though it is not derived from a single external index. The analysis dates are also shared across versions within each migration pair. Each replicate is treated as a distinct model invocation with a matched seed across the incumbent and successor versions.</w:t>
       </w:r>
     </w:p>
     <w:p>
@@ -4984,7 +4998,7 @@
         <w:pStyle w:val="BodyText"/>
       </w:pPr>
       <w:r>
-        <w:t xml:space="preserve">The filing data are converted into a standardized, human-readable summary containing the financial variables required for the credit-health assessment. These include revenue, profitability measures, assets, liabilities, working capital, retained earnings, and book equity. The same summary is supplied to both the incumbent and successor versions for every matched cell, ensuring that observed classification differences are attributable to model-version behavior rather than differences in the available information.</w:t>
+        <w:t xml:space="preserve">The filing data are converted into a standardized, human-readable summary containing the financial variables required for the credit-health assessment. These include revenue, profitability measures, assets, liabilities, working capital, retained earnings, and book equity. The same summary is supplied to both the incumbent and successor versions for every matched cell, so that observed classification differences reflect model-version behavior rather than differences in the available information.</w:t>
       </w:r>
     </w:p>
     <w:p>
@@ -5108,7 +5122,7 @@
         <w:t xml:space="preserve"> </w:t>
       </w:r>
       <w:r>
-        <w:t xml:space="preserve">model [12]. This reference is reproducible but is not treated as realized default ground truth; it serves only as a reproducible yardstick for the secondary accuracy analysis. For each company–date cell, the reference score is calculated from the same financial statements supplied to the LLMs, but the formula and thresholds are not shown to the models during inference.</w:t>
+        <w:t xml:space="preserve">model [12]. This reference is reproducible but is not treated as realized default ground truth; it serves only as a reproducible yardstick for the secondary accuracy analysis. For each company–date cell, the reference score is calculated from the same financial statements supplied to the LLMs, while the formula and thresholds are not shown to the models during inference.</w:t>
       </w:r>
     </w:p>
     <w:p>
@@ -5692,7 +5706,7 @@
         </m:r>
       </m:oMath>
       <w:r>
-        <w:t xml:space="preserve">-score [11]. The reference proxy is deterministic and reproducible for every company–date observation, allowing classification performance to be evaluated without relying on subjective analyst judgments, though it remains a rule-based proxy rather than realized default ground truth.</w:t>
+        <w:t xml:space="preserve">-score [11]. The reference proxy is deterministic and reproducible for every company–date observation, allowing classification performance to be evaluated without relying on subjective analyst judgments, although it remains a rule-based proxy rather than realized default ground truth.</w:t>
       </w:r>
     </w:p>
     <w:p>
@@ -5743,7 +5757,7 @@
         <w:pStyle w:val="FirstParagraph"/>
       </w:pPr>
       <w:r>
-        <w:t xml:space="preserve">The study evaluates two vendor-declared model-version migrations, each involving an incumbent model and a vendor-positioned successor version. Exact snapshot identifiers are recorded and treated as experimental artifacts so that the analysis refers to specific deployed versions rather than broader model-family names, whose capabilities providers typically document only at the level of aggregate technical reports [29]. The evaluated migration pairs are summarized in Table </w:t>
+        <w:t xml:space="preserve">The study evaluates two vendor-declared model-version migrations, each involving an incumbent model and a vendor-positioned successor version. We record the exact snapshot identifiers and treat them as experimental artifacts, so that the analysis refers to specific deployed versions rather than broader model-family names, whose capabilities providers typically document only at the level of aggregate technical reports [29]. The evaluated migration pairs are summarized in Table </w:t>
       </w:r>
       <w:hyperlink w:anchor="tab:models">
         <w:r>
@@ -6104,7 +6118,7 @@
         <w:pStyle w:val="FirstParagraph"/>
       </w:pPr>
       <w:r>
-        <w:t xml:space="preserve">Both evaluated version migrations produce cross-version decision changes substantially above their respective within-version noise floors (Table </w:t>
+        <w:t xml:space="preserve">Both evaluated version migrations produce cross-version decision changes well above their respective within-version noise floors (Table </w:t>
       </w:r>
       <w:hyperlink w:anchor="tab:main">
         <w:r>
@@ -6290,7 +6304,7 @@
         </m:r>
       </m:oMath>
       <w:r>
-        <w:t xml:space="preserve">. This represents an 11.2-percentage-point excess above the estimated within-version floor.</w:t>
+        <w:t xml:space="preserve">. This is an excess of 11.2 percentage points over the estimated within-version floor.</w:t>
       </w:r>
     </w:p>
     <w:p>
@@ -6454,7 +6468,7 @@
         </m:r>
       </m:oMath>
       <w:r>
-        <w:t xml:space="preserve">. For the Gemini migration, the cross-version disagreement rate therefore exceeds the within-version noise floor by 38.1 percentage points beyond ordinary within-version variation.</w:t>
+        <w:t xml:space="preserve">. For the Gemini migration, the cross-version disagreement rate therefore exceeds the within-version noise floor by 38.1 percentage points, beyond ordinary within-version variation.</w:t>
       </w:r>
     </w:p>
     <w:p>
@@ -6462,7 +6476,7 @@
         <w:pStyle w:val="BodyText"/>
       </w:pPr>
       <w:r>
-        <w:t xml:space="preserve">The difference between the two estimates is substantial. The Gemini migration produces an excess flip rate more than three times that of the OpenAI migration. However, both confidence intervals exclude zero, demonstrating that neither result can be explained solely by residual sampling variability within the evaluated versions.</w:t>
+        <w:t xml:space="preserve">There is a substantial difference between the two estimates. The Gemini migration produces an excess flip rate more than three times that of the OpenAI migration. However, both confidence intervals exclude zero, so neither result can be explained solely by residual sampling variability within the evaluated versions.</w:t>
       </w:r>
     </w:p>
     <w:p>
@@ -7400,7 +7414,7 @@
         <w:pStyle w:val="FirstParagraph"/>
       </w:pPr>
       <w:r>
-        <w:t xml:space="preserve">Although both migrations produce statistically significant excess flip rates, the underlying structure of the decision changes differs materially across providers. The prevalence–churn decomposition separates the gross cross-version flip rate into a marginal label-distribution shift and residual company-level churn (Fig. </w:t>
+        <w:t xml:space="preserve">Both migrations produce statistically significant excess flip rates, but the underlying structure of the decision change differs materially across providers. The prevalence–churn decomposition separates the gross cross-version flip rate into a marginal label-distribution shift and residual company-level churn (Fig. </w:t>
       </w:r>
       <w:hyperlink w:anchor="fig:prev">
         <w:r>
@@ -7584,7 +7598,7 @@
         <w:pStyle w:val="BodyText"/>
       </w:pPr>
       <w:r>
-        <w:t xml:space="preserve">Chance-corrected agreement statistics support the same distinction. For the OpenAI pair, Cohen’s</w:t>
+        <w:t xml:space="preserve">Chance-corrected agreement statistics support the same distinction between the two migration pairs. For the OpenAI pair, Cohen’s</w:t>
       </w:r>
       <w:r>
         <w:t xml:space="preserve"> </w:t>
@@ -7614,7 +7628,7 @@
         <w:pStyle w:val="BodyText"/>
       </w:pPr>
       <w:r>
-        <w:t xml:space="preserve">These results show that migration risk cannot be characterized by the excess flip rate alone. Two migrations may both produce material decision discontinuity while operating through different mechanisms: one through company-level reassessment and the other through broad movement in the portfolio’s rating distribution.</w:t>
+        <w:t xml:space="preserve">These results show that migration risk cannot be characterized by the excess flip rate alone. Two migrations may both produce material decision discontinuity while operating through different mechanisms: one mainly reclassifying individual companies, with the overall label distribution remaining relatively stable, and the other producing a broad shift in the portfolio-wide distribution of classifications.</w:t>
       </w:r>
     </w:p>
     <w:p>
@@ -7689,7 +7703,7 @@
         <w:pStyle w:val="FirstParagraph"/>
       </w:pPr>
       <w:r>
-        <w:t xml:space="preserve">The two migrations alter credit-health classifications in opposite directions (Table </w:t>
+        <w:t xml:space="preserve">The two migrations shift credit-health classifications in opposite directions (Table </w:t>
       </w:r>
       <w:hyperlink w:anchor="tab:mix">
         <w:r>
@@ -7990,7 +8004,7 @@
         <w:pStyle w:val="FirstParagraph"/>
       </w:pPr>
       <w:r>
-        <w:t xml:space="preserve">The McNemar diagnostic is consistent with asymmetric movement toward DISTRESS.</w:t>
+        <w:t xml:space="preserve">and the diagnostic is consistent with asymmetric movement toward DISTRESS.</w:t>
       </w:r>
     </w:p>
     <w:p>
@@ -8280,7 +8294,7 @@
         <w:pStyle w:val="FirstParagraph"/>
       </w:pPr>
       <w:r>
-        <w:t xml:space="preserve">The diagnostic is consistent with asymmetric movement away from DISTRESS and toward less severe classifications.</w:t>
+        <w:t xml:space="preserve">and the diagnostic is consistent with asymmetric movement away from DISTRESS and toward less severe classifications.</w:t>
       </w:r>
     </w:p>
     <w:p>
@@ -8796,7 +8810,7 @@
         <w:pStyle w:val="FirstParagraph"/>
       </w:pPr>
       <w:r>
-        <w:t xml:space="preserve">The comparison between the two migrations is robust to the choice of chance-corrected agreement statistic [13, 14, 10]. For OpenAI,</w:t>
+        <w:t xml:space="preserve">The comparison between the two migrations is not sensitive to the choice of chance-corrected agreement statistic [13, 14, 10]. For OpenAI,</w:t>
       </w:r>
     </w:p>
     <w:p>
@@ -9009,7 +9023,7 @@
         <w:pStyle w:val="BodyText"/>
       </w:pPr>
       <w:r>
-        <w:t xml:space="preserve">Migration effects are also larger among observations that are already unstable within the incumbent version. Relative to stable cells, the cross-version flip rate is higher by 0.330 for OpenAI and 0.250 for Gemini. This diagnostic pattern suggests that migration-induced changes are concentrated disproportionately near existing model decision boundaries.</w:t>
+        <w:t xml:space="preserve">Migration effects are also larger among observations that are already unstable within the incumbent version. Relative to stable cells, the cross-version flip rate is higher by 0.330 for OpenAI and 0.250 for Gemini. This diagnostic pattern suggests that migration-induced changes are concentrated disproportionately near existing model decision boundaries, where classifications are already more sensitive to small changes in model behavior.</w:t>
       </w:r>
     </w:p>
     <w:p>
@@ -9391,7 +9405,7 @@
         </m:r>
       </m:oMath>
       <w:r>
-        <w:t xml:space="preserve">. The interval includes zero; the accompanying lower balanced accuracy and macro-F1 are consistent with the distributional shift providing no compensating classification improvement.</w:t>
+        <w:t xml:space="preserve">. The interval includes zero; the accompanying lower balanced accuracy and macro-F1 are consistent with the distributional shift toward SAFE providing no compensating classification improvement.</w:t>
       </w:r>
     </w:p>
     <w:p>
@@ -9828,7 +9842,7 @@
         <w:pStyle w:val="FirstParagraph"/>
       </w:pPr>
       <w:r>
-        <w:t xml:space="preserve">Vendor-driven model-version migration is associated with materially different categorical financial decisions even when the prompt, inputs, inference settings, and downstream workflow remain fixed. After accounting for within-version variability, the noise-adjusted excess cross-version disagreement is approximately 11 percentage points for the OpenAI migration and approximately 38 percentage points for the Gemini migration. The two migrations also differ structurally: OpenAI is primarily churn-dominated and shifts assessments toward greater severity, whereas Gemini is primarily prevalence-dominated and shifts the portfolio toward SAFE. Migration behavior therefore cannot be assumed to be uniformly conservative, permissive, or performance-enhancing.</w:t>
+        <w:t xml:space="preserve">Vendor-driven model-version migration leads to materially different categorical financial decisions even when the prompt, inputs, inference settings, and downstream workflow remain fixed. After accounting for within-version variability, the noise-adjusted excess cross-version disagreement is approximately 11 percentage points for the OpenAI migration and approximately 38 percentage points for the Gemini migration. The two migrations also differ structurally: OpenAI is primarily churn-dominated and shifts assessments toward greater severity, whereas Gemini is primarily prevalence-dominated and shifts the portfolio toward SAFE. Migration behavior therefore cannot be assumed to be uniformly conservative, permissive, or performance-enhancing.</w:t>
       </w:r>
     </w:p>
     <w:p>
@@ -10398,7 +10412,7 @@
         <w:t xml:space="preserve"> </w:t>
       </w:r>
       <w:r>
-        <w:t xml:space="preserve">Hosted LLM endpoints may remain stochastic even when temperature is set to zero and a seed is supplied. The study therefore does not assume deterministic model behavior. Instead, repeated within-version calls estimate residual variability, which is subtracted from the cross-version flip rate in the primary endpoint.</w:t>
+        <w:t xml:space="preserve">Hosted LLM endpoints can remain stochastic even when temperature is set to zero and a seed is supplied. The study therefore does not assume deterministic model behavior. Instead, repeated within-version calls estimate residual variability, which is subtracted from the cross-version flip rate in the primary endpoint.</w:t>
       </w:r>
     </w:p>
     <w:p>
@@ -10449,7 +10463,7 @@
         <w:t xml:space="preserve"> </w:t>
       </w:r>
       <w:r>
-        <w:t xml:space="preserve">DISTRESS classifications constitute a relatively small share of the evaluated observations, so estimates involving movement into or out of the most severe category are based on fewer cells than the SAFE and WATCH comparisons. This does not affect the primary migration-instability result, which does not depend on the prevalence of the Altman reference label.</w:t>
+        <w:t xml:space="preserve">DISTRESS classifications constitute a relatively small share of the evaluated observations, so estimates involving movement into or out of the most severe category are based on fewer cells than the SAFE and WATCH comparisons. Estimates involving the DISTRESS class should therefore be interpreted with caution. This does not affect the primary migration-instability result, which does not depend on the prevalence of the Altman reference label.</w:t>
       </w:r>
     </w:p>
     <w:p>

</xml_diff>

<commit_message>
Replace the second author's biography photograph; pin the highlighted-PDF baseline
Swap in a new black-and-white portrait for Robin Chawla, cropped to the 1.0 x
1.25 in area the IEEEtran biography environment reserves.

Committing the revision broke the highlighted-PDF build: build_highlighted.sh
diffed against git HEAD, which was the as-submitted manuscript only while the
revision was uncommitted. The baseline is now pinned to the as-submitted tag,
and the script fails with a clear message if that tag is absent.

check_highlighting.py carried its own copy of the same default, so pinning the
build left the two disagreeing and the audit compared the revision against
itself -- one addition, one deletion -- while still reporting OK. It now reads
the baseline from build_highlighted.sh and refuses a baseline that differs from
the revision by almost nothing.
</commit_message>
<xml_diff>
--- a/paper/main.docx
+++ b/paper/main.docx
@@ -13214,7 +13214,7 @@
       <w:r>
         <w:drawing>
           <wp:inline>
-            <wp:extent cx="914400" cy="1143616"/>
+            <wp:extent cx="914400" cy="1143344"/>
             <wp:effectExtent b="0" l="0" r="0" t="0"/>
             <wp:docPr descr="image" title="" id="77" name="Picture"/>
             <a:graphic>
@@ -13235,7 +13235,7 @@
                   <pic:spPr bwMode="auto">
                     <a:xfrm>
                       <a:off x="0" y="0"/>
-                      <a:ext cx="914400" cy="1143616"/>
+                      <a:ext cx="914400" cy="1143344"/>
                     </a:xfrm>
                     <a:prstGeom prst="rect">
                       <a:avLst/>

</xml_diff>